<commit_message>
refactored to match latest version to be submitted
</commit_message>
<xml_diff>
--- a/IR_Assignment1_Report_Final.docx
+++ b/IR_Assignment1_Report_Final.docx
@@ -75,27 +75,7 @@
           <w:sz w:val="36"/>
           <w:szCs w:val="36"/>
         </w:rPr>
-        <w:t xml:space="preserve">Work Integrated Learning </w:t>
-      </w:r>
-      <w:proofErr w:type="spellStart"/>
-      <w:r>
-        <w:rPr>
-          <w:b/>
-          <w:color w:val="505050"/>
-          <w:sz w:val="36"/>
-          <w:szCs w:val="36"/>
-        </w:rPr>
-        <w:t>Programmes</w:t>
-      </w:r>
-      <w:proofErr w:type="spellEnd"/>
-      <w:r>
-        <w:rPr>
-          <w:b/>
-          <w:color w:val="505050"/>
-          <w:sz w:val="36"/>
-          <w:szCs w:val="36"/>
-        </w:rPr>
-        <w:t xml:space="preserve"> (WILP)</w:t>
+        <w:t>Work Integrated Learning Programmes (WILP)</w:t>
       </w:r>
       <w:r>
         <w:rPr>
@@ -167,17 +147,7 @@
           <w:sz w:val="32"/>
           <w:szCs w:val="32"/>
         </w:rPr>
-        <w:t xml:space="preserve">Design and Implementation of an End-to-End IR System using </w:t>
-      </w:r>
-      <w:proofErr w:type="spellStart"/>
-      <w:r>
-        <w:rPr>
-          <w:i/>
-          <w:color w:val="646464"/>
-          <w:sz w:val="32"/>
-          <w:szCs w:val="32"/>
-        </w:rPr>
-        <w:t>Streamli</w:t>
+        <w:t>Design and Implementation of an End-to-End IR System using Streamli</w:t>
       </w:r>
       <w:r>
         <w:rPr>
@@ -188,7 +158,6 @@
         </w:rPr>
         <w:t>t</w:t>
       </w:r>
-      <w:proofErr w:type="spellEnd"/>
     </w:p>
     <w:p/>
     <w:p/>
@@ -313,7 +282,25 @@
                 <w:sz w:val="28"/>
                 <w:szCs w:val="28"/>
               </w:rPr>
-              <w:t>Team Members / Prepared By:</w:t>
+              <w:t>Team Members / Prepared By</w:t>
+            </w:r>
+            <w:r>
+              <w:rPr>
+                <w:b/>
+                <w:color w:val="003366"/>
+                <w:sz w:val="28"/>
+                <w:szCs w:val="28"/>
+              </w:rPr>
+              <w:t xml:space="preserve"> (Group E)</w:t>
+            </w:r>
+            <w:r>
+              <w:rPr>
+                <w:b/>
+                <w:color w:val="003366"/>
+                <w:sz w:val="28"/>
+                <w:szCs w:val="28"/>
+              </w:rPr>
+              <w:t>:</w:t>
             </w:r>
           </w:p>
           <w:p>
@@ -404,36 +391,12 @@
     </w:p>
     <w:p>
       <w:r>
-        <w:t xml:space="preserve">For this assignment, we built an interactive Information Retrieval (IR) web application using Python, NLTK, and </w:t>
-      </w:r>
-      <w:proofErr w:type="spellStart"/>
-      <w:r>
-        <w:t>Streamlit</w:t>
-      </w:r>
-      <w:proofErr w:type="spellEnd"/>
-      <w:r>
-        <w:t>. The goal was to create an end-to-end tool where users can upload text files, test individual preprocessing steps, compare indexing techniques (</w:t>
-      </w:r>
-      <w:proofErr w:type="spellStart"/>
-      <w:r>
-        <w:t>Biword</w:t>
-      </w:r>
-      <w:proofErr w:type="spellEnd"/>
-      <w:r>
-        <w:t xml:space="preserve"> vs. Positional), benchmark term lookup structures (BST vs. B-Tree), and run tolerant search queries (wildcard, spell check, and phonetic search).</w:t>
+        <w:t>For this assignment, we built an interactive Information Retrieval (IR) web application using Python, NLTK, and Streamlit. The goal was to create an end-to-end tool where users can upload text files, test individual preprocessing steps, compare indexing techniques (Biword vs. Positional), benchmark term lookup structures (BST vs. B-Tree), and run tolerant search queries (wildcard, spell check, and phonetic search).</w:t>
       </w:r>
     </w:p>
     <w:p>
       <w:r>
-        <w:t xml:space="preserve">The application is structured entirely around </w:t>
-      </w:r>
-      <w:proofErr w:type="spellStart"/>
-      <w:r>
-        <w:t>Streamlit's</w:t>
-      </w:r>
-      <w:proofErr w:type="spellEnd"/>
-      <w:r>
-        <w:t xml:space="preserve"> web interface, allowing all inputs and outputs to be viewed directly in the browser without running terminal scripts or viewing static notebooks during execution.</w:t>
+        <w:t>The application is structured entirely around Streamlit's web interface, allowing all inputs and outputs to be viewed directly in the browser without running terminal scripts or viewing static notebooks during execution.</w:t>
       </w:r>
     </w:p>
     <w:tbl>
@@ -524,37 +487,12 @@
             <w:pPr>
               <w:jc w:val="center"/>
             </w:pPr>
-            <w:proofErr w:type="spellStart"/>
             <w:r>
               <w:rPr>
                 <w:i/>
                 <w:sz w:val="18"/>
               </w:rPr>
-              <w:t>Streamlit</w:t>
-            </w:r>
-            <w:proofErr w:type="spellEnd"/>
-            <w:r>
-              <w:rPr>
-                <w:i/>
-                <w:sz w:val="18"/>
-              </w:rPr>
-              <w:t xml:space="preserve"> application landing page (executed via Cloudflare Tunnel on the BITS </w:t>
-            </w:r>
-            <w:proofErr w:type="spellStart"/>
-            <w:r>
-              <w:rPr>
-                <w:i/>
-                <w:sz w:val="18"/>
-              </w:rPr>
-              <w:t>RunPod</w:t>
-            </w:r>
-            <w:proofErr w:type="spellEnd"/>
-            <w:r>
-              <w:rPr>
-                <w:i/>
-                <w:sz w:val="18"/>
-              </w:rPr>
-              <w:t xml:space="preserve"> Virtual Lab pod)</w:t>
+              <w:t>Streamlit application landing page (executed via Cloudflare Tunnel on the BITS RunPod Virtual Lab pod)</w:t>
             </w:r>
           </w:p>
         </w:tc>
@@ -582,38 +520,12 @@
           <w:color w:val="003366"/>
           <w:sz w:val="26"/>
         </w:rPr>
-        <w:t xml:space="preserve">2. </w:t>
-      </w:r>
-      <w:proofErr w:type="spellStart"/>
-      <w:r>
-        <w:rPr>
-          <w:b/>
-          <w:color w:val="003366"/>
-          <w:sz w:val="26"/>
-        </w:rPr>
-        <w:t>Streamlit</w:t>
-      </w:r>
-      <w:proofErr w:type="spellEnd"/>
-      <w:r>
-        <w:rPr>
-          <w:b/>
-          <w:color w:val="003366"/>
-          <w:sz w:val="26"/>
-        </w:rPr>
-        <w:t xml:space="preserve"> Front-End Workflow</w:t>
+        <w:t>2. Streamlit Front-End Workflow</w:t>
       </w:r>
     </w:p>
     <w:p>
       <w:r>
-        <w:t xml:space="preserve">We divided the user workflow into four distinct tabs in </w:t>
-      </w:r>
-      <w:proofErr w:type="spellStart"/>
-      <w:r>
-        <w:t>Streamlit</w:t>
-      </w:r>
-      <w:proofErr w:type="spellEnd"/>
-      <w:r>
-        <w:t>:</w:t>
+        <w:t>We divided the user workflow into four distinct tabs in Streamlit:</w:t>
       </w:r>
     </w:p>
     <w:p>
@@ -623,23 +535,7 @@
     </w:p>
     <w:p>
       <w:r>
-        <w:t xml:space="preserve">• Tab 2 (Phrase Query Processing): Displays </w:t>
-      </w:r>
-      <w:proofErr w:type="spellStart"/>
-      <w:r>
-        <w:t>biword</w:t>
-      </w:r>
-      <w:proofErr w:type="spellEnd"/>
-      <w:r>
-        <w:t xml:space="preserve"> and positional posting lists, accepts phrase queries, and shows cases where </w:t>
-      </w:r>
-      <w:proofErr w:type="spellStart"/>
-      <w:r>
-        <w:t>biwords</w:t>
-      </w:r>
-      <w:proofErr w:type="spellEnd"/>
-      <w:r>
-        <w:t xml:space="preserve"> create false positives.</w:t>
+        <w:t>• Tab 2 (Phrase Query Processing): Displays biword and positional posting lists, accepts phrase queries, and shows cases where biwords create false positives.</w:t>
       </w:r>
     </w:p>
     <w:p>
@@ -875,102 +771,27 @@
     </w:p>
     <w:p>
       <w:r>
-        <w:t>2. Stage 1 (Hyphen Handling): Replaces hyphens with spaces (</w:t>
-      </w:r>
-      <w:proofErr w:type="spellStart"/>
-      <w:proofErr w:type="gramStart"/>
-      <w:r>
-        <w:t>text.replace</w:t>
-      </w:r>
-      <w:proofErr w:type="spellEnd"/>
-      <w:proofErr w:type="gramEnd"/>
-      <w:r>
-        <w:t>('-', ' ')) so compound words like 'state-of-the-art' split into distinct words ('state', 'of', 'the', 'art').</w:t>
+        <w:t>2. Stage 1 (Hyphen Handling): Replaces hyphens with spaces (text.replace('-', ' ')) so compound words like 'state-of-the-art' split into distinct words ('state', 'of', 'the', 'art').</w:t>
       </w:r>
     </w:p>
     <w:p>
       <w:r>
-        <w:t>3. Stage 2 (Lowercasing): Converts text to lowercase (</w:t>
-      </w:r>
-      <w:proofErr w:type="spellStart"/>
-      <w:proofErr w:type="gramStart"/>
-      <w:r>
-        <w:t>text.lower</w:t>
-      </w:r>
-      <w:proofErr w:type="spellEnd"/>
-      <w:proofErr w:type="gramEnd"/>
-      <w:r>
-        <w:t>()) to ensure case-insensitive matching.</w:t>
+        <w:t>3. Stage 2 (Lowercasing): Converts text to lowercase (text.lower()) to ensure case-insensitive matching.</w:t>
       </w:r>
     </w:p>
     <w:p>
       <w:r>
-        <w:t xml:space="preserve">4. Stage 3 (Tokenization): Uses NLTK's </w:t>
-      </w:r>
-      <w:proofErr w:type="spellStart"/>
-      <w:r>
-        <w:t>word_</w:t>
-      </w:r>
-      <w:proofErr w:type="gramStart"/>
-      <w:r>
-        <w:t>tokenize</w:t>
-      </w:r>
-      <w:proofErr w:type="spellEnd"/>
-      <w:r>
-        <w:t>(</w:t>
-      </w:r>
-      <w:proofErr w:type="gramEnd"/>
-      <w:r>
-        <w:t>) and filters out punctuation to keep alphanumeric tokens.</w:t>
+        <w:t>4. Stage 3 (Tokenization): Uses NLTK's word_tokenize() and filters out punctuation to keep alphanumeric tokens.</w:t>
       </w:r>
     </w:p>
     <w:p>
       <w:r>
-        <w:t xml:space="preserve">5. Stage 4 (Stop Word Removal): Filters out standard English stop words using </w:t>
-      </w:r>
-      <w:proofErr w:type="spellStart"/>
-      <w:proofErr w:type="gramStart"/>
-      <w:r>
-        <w:t>nltk.corpus</w:t>
-      </w:r>
-      <w:proofErr w:type="gramEnd"/>
-      <w:r>
-        <w:t>.stopwords</w:t>
-      </w:r>
-      <w:proofErr w:type="spellEnd"/>
-      <w:r>
-        <w:t>.</w:t>
+        <w:t>5. Stage 4 (Stop Word Removal): Filters out standard English stop words using nltk.corpus.stopwords.</w:t>
       </w:r>
     </w:p>
     <w:p>
       <w:r>
-        <w:t xml:space="preserve">6. Stage 5 (Normalization): Applies </w:t>
-      </w:r>
-      <w:proofErr w:type="spellStart"/>
-      <w:proofErr w:type="gramStart"/>
-      <w:r>
-        <w:t>PorterStemmer</w:t>
-      </w:r>
-      <w:proofErr w:type="spellEnd"/>
-      <w:r>
-        <w:t>(</w:t>
-      </w:r>
-      <w:proofErr w:type="gramEnd"/>
-      <w:r>
-        <w:t xml:space="preserve">) or </w:t>
-      </w:r>
-      <w:proofErr w:type="spellStart"/>
-      <w:proofErr w:type="gramStart"/>
-      <w:r>
-        <w:t>WordNetLemmatizer</w:t>
-      </w:r>
-      <w:proofErr w:type="spellEnd"/>
-      <w:r>
-        <w:t>(</w:t>
-      </w:r>
-      <w:proofErr w:type="gramEnd"/>
-      <w:r>
-        <w:t>) based on user choice.</w:t>
+        <w:t>6. Stage 5 (Normalization): Applies PorterStemmer() or WordNetLemmatizer() based on user choice.</w:t>
       </w:r>
     </w:p>
     <w:tbl>
@@ -1090,36 +911,12 @@
     </w:p>
     <w:p>
       <w:r>
-        <w:t>• Compression Rate = (1 - |</w:t>
-      </w:r>
-      <w:proofErr w:type="spellStart"/>
-      <w:r>
-        <w:t>Vocab_normalized</w:t>
-      </w:r>
-      <w:proofErr w:type="spellEnd"/>
-      <w:r>
-        <w:t>| / |</w:t>
-      </w:r>
-      <w:proofErr w:type="spellStart"/>
-      <w:r>
-        <w:t>Vocab_raw</w:t>
-      </w:r>
-      <w:proofErr w:type="spellEnd"/>
-      <w:r>
-        <w:t>|) * 100</w:t>
+        <w:t>• Compression Rate = (1 - |Vocab_normalized| / |Vocab_raw|) * 100</w:t>
       </w:r>
     </w:p>
     <w:p>
       <w:r>
-        <w:t>• Lexical Validity = (|Tokens in WordNet| / |</w:t>
-      </w:r>
-      <w:proofErr w:type="spellStart"/>
-      <w:r>
-        <w:t>Vocab_normalized</w:t>
-      </w:r>
-      <w:proofErr w:type="spellEnd"/>
-      <w:r>
-        <w:t>|) * 100</w:t>
+        <w:t>• Lexical Validity = (|Tokens in WordNet| / |Vocab_normalized|) * 100</w:t>
       </w:r>
     </w:p>
     <w:p>
@@ -1440,23 +1237,7 @@
     <w:p/>
     <w:p>
       <w:r>
-        <w:t>Conclusion &amp; Decision: Lemmatization is more suitable for this dataset. Porter Stemming reduced vocabulary size slightly more than Lemmatization, but it produced several non-dictionary word roots (such as '</w:t>
-      </w:r>
-      <w:proofErr w:type="spellStart"/>
-      <w:r>
-        <w:t>univers</w:t>
-      </w:r>
-      <w:proofErr w:type="spellEnd"/>
-      <w:r>
-        <w:t>' for university or '</w:t>
-      </w:r>
-      <w:proofErr w:type="spellStart"/>
-      <w:r>
-        <w:t>technolog</w:t>
-      </w:r>
-      <w:proofErr w:type="spellEnd"/>
-      <w:r>
-        <w:t>' for technology). Lemmatization maintained 95.32% real English words versus 67.48% for Stemming, which is essential because downstream components like edit distance spell correction and wildcard matching rely on valid word forms. The composite score confirms this: WordNet Lemmatization scored 0.7481 versus 0.6342 for Porter Stemming.</w:t>
+        <w:t>Conclusion &amp; Decision: Lemmatization is more suitable for this dataset. Porter Stemming reduced vocabulary size slightly more than Lemmatization, but it produced several non-dictionary word roots (such as 'univers' for university or 'technolog' for technology). Lemmatization maintained 95.32% real English words versus 67.48% for Stemming, which is essential because downstream components like edit distance spell correction and wildcard matching rely on valid word forms. The composite score confirms this: WordNet Lemmatization scored 0.7481 versus 0.6342 for Porter Stemming.</w:t>
       </w:r>
     </w:p>
     <w:p/>
@@ -1562,64 +1343,22 @@
           <w:color w:val="003366"/>
           <w:sz w:val="26"/>
         </w:rPr>
-        <w:t xml:space="preserve">4. Phrase Query Processing: </w:t>
-      </w:r>
-      <w:proofErr w:type="spellStart"/>
-      <w:r>
-        <w:rPr>
-          <w:b/>
-          <w:color w:val="003366"/>
-          <w:sz w:val="26"/>
-        </w:rPr>
-        <w:t>Biword</w:t>
-      </w:r>
-      <w:proofErr w:type="spellEnd"/>
-      <w:r>
-        <w:rPr>
-          <w:b/>
-          <w:color w:val="003366"/>
-          <w:sz w:val="26"/>
-        </w:rPr>
-        <w:t xml:space="preserve"> vs. Positional Index</w:t>
+        <w:t>4. Phrase Query Processing: Biword vs. Positional Index</w:t>
       </w:r>
     </w:p>
     <w:p>
       <w:r>
-        <w:t xml:space="preserve">We implemented both a </w:t>
-      </w:r>
-      <w:proofErr w:type="spellStart"/>
-      <w:r>
-        <w:t>Biword</w:t>
-      </w:r>
-      <w:proofErr w:type="spellEnd"/>
-      <w:r>
-        <w:t xml:space="preserve"> Index and a Positional Index to handle phrase queries.</w:t>
+        <w:t>We implemented both a Biword Index and a Positional Index to handle phrase queries.</w:t>
       </w:r>
     </w:p>
     <w:p>
       <w:r>
-        <w:t xml:space="preserve">• </w:t>
-      </w:r>
-      <w:proofErr w:type="spellStart"/>
-      <w:r>
-        <w:t>Biword</w:t>
-      </w:r>
-      <w:proofErr w:type="spellEnd"/>
-      <w:r>
-        <w:t xml:space="preserve"> Index: Indexes pairs of consecutive words (e.g. 'information retrieval').</w:t>
+        <w:t>• Biword Index: Indexes pairs of consecutive words (e.g. 'information retrieval').</w:t>
       </w:r>
     </w:p>
     <w:p>
       <w:r>
-        <w:t>• Positional Index: Stores the exact word position numbers for every term in each document: term -&gt; {</w:t>
-      </w:r>
-      <w:proofErr w:type="spellStart"/>
-      <w:r>
-        <w:t>doc_id</w:t>
-      </w:r>
-      <w:proofErr w:type="spellEnd"/>
-      <w:r>
-        <w:t>: [pos1, pos2, ...]}.</w:t>
+        <w:t>• Positional Index: Stores the exact word position numbers for every term in each document: term -&gt; {doc_id: [pos1, pos2, ...]}.</w:t>
       </w:r>
     </w:p>
     <w:p>
@@ -1634,59 +1373,17 @@
           <w:sz w:val="23"/>
         </w:rPr>
         <w:lastRenderedPageBreak/>
-        <w:t xml:space="preserve">4.1 Why </w:t>
-      </w:r>
-      <w:proofErr w:type="spellStart"/>
-      <w:r>
-        <w:rPr>
-          <w:b/>
-          <w:color w:val="336699"/>
-          <w:sz w:val="23"/>
-        </w:rPr>
-        <w:t>Biword</w:t>
-      </w:r>
-      <w:proofErr w:type="spellEnd"/>
-      <w:r>
-        <w:rPr>
-          <w:b/>
-          <w:color w:val="336699"/>
-          <w:sz w:val="23"/>
-        </w:rPr>
-        <w:t xml:space="preserve"> Indexes Produce False Positives</w:t>
+        <w:t>4.1 Why Biword Indexes Produce False Positives</w:t>
       </w:r>
     </w:p>
     <w:p>
       <w:r>
-        <w:t xml:space="preserve">When a user searches for a phrase with 3 or more words, such as 'information retrieval system', the </w:t>
-      </w:r>
-      <w:proofErr w:type="spellStart"/>
-      <w:r>
-        <w:t>Biword</w:t>
-      </w:r>
-      <w:proofErr w:type="spellEnd"/>
-      <w:r>
-        <w:t xml:space="preserve"> Index breaks the query into two independent pairs: ('information retrieval') AND ('retrieval system').</w:t>
+        <w:t>When a user searches for a phrase with 3 or more words, such as 'information retrieval system', the Biword Index breaks the query into two independent pairs: ('information retrieval') AND ('retrieval system').</w:t>
       </w:r>
     </w:p>
     <w:p>
       <w:r>
-        <w:t xml:space="preserve">If a document contains the pair 'retrieval system' in paragraph 1 and 'information retrieval' in paragraph 4, both </w:t>
-      </w:r>
-      <w:proofErr w:type="spellStart"/>
-      <w:r>
-        <w:t>biword</w:t>
-      </w:r>
-      <w:proofErr w:type="spellEnd"/>
-      <w:r>
-        <w:t xml:space="preserve"> pairs match. The </w:t>
-      </w:r>
-      <w:proofErr w:type="spellStart"/>
-      <w:r>
-        <w:t>biword</w:t>
-      </w:r>
-      <w:proofErr w:type="spellEnd"/>
-      <w:r>
-        <w:t xml:space="preserve"> index will return this document as a match, even though the full phrase 'information retrieval system' never appears.</w:t>
+        <w:t>If a document contains the pair 'retrieval system' in paragraph 1 and 'information retrieval' in paragraph 4, both biword pairs match. The biword index will return this document as a match, even though the full phrase 'information retrieval system' never appears.</w:t>
       </w:r>
     </w:p>
     <w:p>
@@ -1705,36 +1402,12 @@
     </w:p>
     <w:p>
       <w:r>
-        <w:t>The Positional Index checks actual word position numbers stored in the postings list. For a multi-word phrase query, it requires that position(word_i+1) = position(</w:t>
-      </w:r>
-      <w:proofErr w:type="spellStart"/>
-      <w:r>
-        <w:t>word_i</w:t>
-      </w:r>
-      <w:proofErr w:type="spellEnd"/>
-      <w:r>
-        <w:t>) + 1. Because it checks both word order and exact position adjacency, it eliminates false positive matches.</w:t>
+        <w:t>The Positional Index checks actual word position numbers stored in the postings list. For a multi-word phrase query, it requires that position(word_i+1) = position(word_i) + 1. Because it checks both word order and exact position adjacency, it eliminates false positive matches.</w:t>
       </w:r>
     </w:p>
     <w:p>
       <w:r>
-        <w:t xml:space="preserve">Concrete result from our system: querying 'information retrieval system' against our 5-document corpus returned 2 documents via the </w:t>
-      </w:r>
-      <w:proofErr w:type="spellStart"/>
-      <w:r>
-        <w:t>Biword</w:t>
-      </w:r>
-      <w:proofErr w:type="spellEnd"/>
-      <w:r>
-        <w:t xml:space="preserve"> Index (doc-1.txt and doc-3.txt) but only 1 document via the Positional Index (doc-1.txt). doc-3.txt contains the pairs 'information retrieval' and 'retrieval system' separately, but never the contiguous three-word phrase -- confirming it as a genuine </w:t>
-      </w:r>
-      <w:proofErr w:type="spellStart"/>
-      <w:r>
-        <w:t>biword</w:t>
-      </w:r>
-      <w:proofErr w:type="spellEnd"/>
-      <w:r>
-        <w:t xml:space="preserve"> false positive that the positional index correctly rejects.</w:t>
+        <w:t>Concrete result from our system: querying 'information retrieval system' against our 5-document corpus returned 2 documents via the Biword Index (doc-1.txt and doc-3.txt) but only 1 document via the Positional Index (doc-1.txt). doc-3.txt contains the pairs 'information retrieval' and 'retrieval system' separately, but never the contiguous three-word phrase -- confirming it as a genuine biword false positive that the positional index correctly rejects.</w:t>
       </w:r>
     </w:p>
     <w:tbl>
@@ -1821,23 +1494,7 @@
                 <w:i/>
                 <w:sz w:val="18"/>
               </w:rPr>
-              <w:t xml:space="preserve">Sample </w:t>
-            </w:r>
-            <w:proofErr w:type="spellStart"/>
-            <w:r>
-              <w:rPr>
-                <w:i/>
-                <w:sz w:val="18"/>
-              </w:rPr>
-              <w:t>Biword</w:t>
-            </w:r>
-            <w:proofErr w:type="spellEnd"/>
-            <w:r>
-              <w:rPr>
-                <w:i/>
-                <w:sz w:val="18"/>
-              </w:rPr>
-              <w:t xml:space="preserve"> Index and Positional Index postings (JSON view)</w:t>
+              <w:t>Sample Biword Index and Positional Index postings (JSON view)</w:t>
             </w:r>
           </w:p>
         </w:tc>
@@ -1929,23 +1586,7 @@
                 <w:i/>
                 <w:sz w:val="18"/>
               </w:rPr>
-              <w:t xml:space="preserve">Query 'information retrieval system': </w:t>
-            </w:r>
-            <w:proofErr w:type="spellStart"/>
-            <w:r>
-              <w:rPr>
-                <w:i/>
-                <w:sz w:val="18"/>
-              </w:rPr>
-              <w:t>Biword</w:t>
-            </w:r>
-            <w:proofErr w:type="spellEnd"/>
-            <w:r>
-              <w:rPr>
-                <w:i/>
-                <w:sz w:val="18"/>
-              </w:rPr>
-              <w:t xml:space="preserve"> Index returns 2 documents (doc-1.txt, doc-3.txt) while Positional Index correctly returns only 1 (doc-1.txt) -- doc-3.txt is the false positive</w:t>
+              <w:t>Query 'information retrieval system': Biword Index returns 2 documents (doc-1.txt, doc-3.txt) while Positional Index correctly returns only 1 (doc-1.txt) -- doc-3.txt is the false positive</w:t>
             </w:r>
           </w:p>
         </w:tc>
@@ -2138,11 +1779,9 @@
             </w:tcMar>
           </w:tcPr>
           <w:p>
-            <w:proofErr w:type="spellStart"/>
             <w:r>
               <w:t>achiev</w:t>
             </w:r>
-            <w:proofErr w:type="spellEnd"/>
           </w:p>
         </w:tc>
         <w:tc>
@@ -2461,11 +2100,9 @@
             </w:tcMar>
           </w:tcPr>
           <w:p>
-            <w:proofErr w:type="spellStart"/>
             <w:r>
               <w:t>databas</w:t>
             </w:r>
-            <w:proofErr w:type="spellEnd"/>
           </w:p>
         </w:tc>
         <w:tc>
@@ -2677,11 +2314,9 @@
             </w:tcMar>
           </w:tcPr>
           <w:p>
-            <w:proofErr w:type="spellStart"/>
             <w:r>
               <w:t>missingworddatabas</w:t>
             </w:r>
-            <w:proofErr w:type="spellEnd"/>
           </w:p>
         </w:tc>
         <w:tc>
@@ -2777,20 +2412,7 @@
       </w:r>
       <w:r>
         <w:lastRenderedPageBreak/>
-        <w:t xml:space="preserve">unbalanced, leading to O(N) depth. A B-Tree guarantees balanced search depth of </w:t>
-      </w:r>
-      <w:proofErr w:type="gramStart"/>
-      <w:r>
-        <w:t>O(</w:t>
-      </w:r>
-      <w:proofErr w:type="spellStart"/>
-      <w:proofErr w:type="gramEnd"/>
-      <w:r>
-        <w:t>log_B</w:t>
-      </w:r>
-      <w:proofErr w:type="spellEnd"/>
-      <w:r>
-        <w:t xml:space="preserve"> N) and fits disk page layout, making B-Trees much better suited for large production search systems.</w:t>
+        <w:t>unbalanced, leading to O(N) depth. A B-Tree guarantees balanced search depth of O(log_B N) and fits disk page layout, making B-Trees much better suited for large production search systems.</w:t>
       </w:r>
     </w:p>
     <w:tbl>
@@ -2905,49 +2527,17 @@
     </w:p>
     <w:p>
       <w:r>
-        <w:t>1. Wildcard Queries (2-Gram Index): Wildcard terms like 'data*' are decomposed into 2-grams ('$d', 'da', 'at', 'ta'). The system queries the 2-gram index to filter candidate words, then applies regular expression matching to return valid matches -- e.g. 'data*' correctly matched both 'data' and '</w:t>
-      </w:r>
-      <w:proofErr w:type="spellStart"/>
-      <w:r>
-        <w:t>databas</w:t>
-      </w:r>
-      <w:proofErr w:type="spellEnd"/>
-      <w:r>
-        <w:t>' (the stemmed form of 'database') in our vocabulary.</w:t>
+        <w:t>1. Wildcard Queries (2-Gram Index): Wildcard terms like 'data*' are decomposed into 2-grams ('$d', 'da', 'at', 'ta'). The system queries the 2-gram index to filter candidate words, then applies regular expression matching to return valid matches -- e.g. 'data*' correctly matched both 'data' and 'databas' (the stemmed form of 'database') in our vocabulary.</w:t>
       </w:r>
     </w:p>
     <w:p>
       <w:r>
-        <w:t>2. Spelling Correction (</w:t>
-      </w:r>
-      <w:proofErr w:type="spellStart"/>
-      <w:r>
-        <w:t>Levenshtein</w:t>
-      </w:r>
-      <w:proofErr w:type="spellEnd"/>
-      <w:r>
-        <w:t xml:space="preserve"> Edit Distance): Uses dynamic programming to compute minimum insertions, deletions, and substitutions needed to turn the query into a dictionary term within a chosen edit distance threshold (1 to 3) -- e.g. the misspelled query '</w:t>
-      </w:r>
-      <w:proofErr w:type="spellStart"/>
-      <w:r>
-        <w:t>deta</w:t>
-      </w:r>
-      <w:proofErr w:type="spellEnd"/>
-      <w:r>
-        <w:t>' was corrected to 'data' at an edit distance of 1.</w:t>
+        <w:t>2. Spelling Correction (Levenshtein Edit Distance): Uses dynamic programming to compute minimum insertions, deletions, and substitutions needed to turn the query into a dictionary term within a chosen edit distance threshold (1 to 3) -- e.g. the misspelled query 'deta' was corrected to 'data' at an edit distance of 1.</w:t>
       </w:r>
     </w:p>
     <w:p>
       <w:r>
-        <w:t>3. Phonetic Search (Soundex): Maps terms to 4-character phonetic codes based on how they sound, matching words that sound similar despite different spelling -- e.g. our system computed the Soundex code A426 for the misspelled query '</w:t>
-      </w:r>
-      <w:proofErr w:type="spellStart"/>
-      <w:r>
-        <w:t>algoritm</w:t>
-      </w:r>
-      <w:proofErr w:type="spellEnd"/>
-      <w:r>
-        <w:t>', correctly matching it to the dictionary term 'algorithm'.</w:t>
+        <w:t>3. Phonetic Search (Soundex): Maps terms to 4-character phonetic codes based on how they sound, matching words that sound similar despite different spelling -- e.g. our system computed the Soundex code A426 for the misspelled query 'algoritm', correctly matching it to the dictionary term 'algorithm'.</w:t>
       </w:r>
     </w:p>
     <w:tbl>
@@ -3035,23 +2625,7 @@
                 <w:i/>
                 <w:sz w:val="18"/>
               </w:rPr>
-              <w:t>Wildcard search ('data*') via 2-gram index, matching 'data' and '</w:t>
-            </w:r>
-            <w:proofErr w:type="spellStart"/>
-            <w:r>
-              <w:rPr>
-                <w:i/>
-                <w:sz w:val="18"/>
-              </w:rPr>
-              <w:t>databas</w:t>
-            </w:r>
-            <w:proofErr w:type="spellEnd"/>
-            <w:r>
-              <w:rPr>
-                <w:i/>
-                <w:sz w:val="18"/>
-              </w:rPr>
-              <w:t>'</w:t>
+              <w:t>Wildcard search ('data*') via 2-gram index, matching 'data' and 'databas'</w:t>
             </w:r>
           </w:p>
         </w:tc>
@@ -3137,53 +2711,12 @@
             <w:pPr>
               <w:jc w:val="center"/>
             </w:pPr>
-            <w:proofErr w:type="spellStart"/>
             <w:r>
               <w:rPr>
                 <w:i/>
                 <w:sz w:val="18"/>
               </w:rPr>
-              <w:t>Levenshtein</w:t>
-            </w:r>
-            <w:proofErr w:type="spellEnd"/>
-            <w:r>
-              <w:rPr>
-                <w:i/>
-                <w:sz w:val="18"/>
-              </w:rPr>
-              <w:t xml:space="preserve"> edit-distance correction ('</w:t>
-            </w:r>
-            <w:proofErr w:type="spellStart"/>
-            <w:r>
-              <w:rPr>
-                <w:i/>
-                <w:sz w:val="18"/>
-              </w:rPr>
-              <w:t>deta</w:t>
-            </w:r>
-            <w:proofErr w:type="spellEnd"/>
-            <w:r>
-              <w:rPr>
-                <w:i/>
-                <w:sz w:val="18"/>
-              </w:rPr>
-              <w:t>' -&gt; 'data') and Soundex phonetic match ('</w:t>
-            </w:r>
-            <w:proofErr w:type="spellStart"/>
-            <w:r>
-              <w:rPr>
-                <w:i/>
-                <w:sz w:val="18"/>
-              </w:rPr>
-              <w:t>algoritm</w:t>
-            </w:r>
-            <w:proofErr w:type="spellEnd"/>
-            <w:r>
-              <w:rPr>
-                <w:i/>
-                <w:sz w:val="18"/>
-              </w:rPr>
-              <w:t>' -&gt; 'algorithm', code A426)</w:t>
+              <w:t>Levenshtein edit-distance correction ('deta' -&gt; 'data') and Soundex phonetic match ('algoritm' -&gt; 'algorithm', code A426)</w:t>
             </w:r>
           </w:p>
         </w:tc>
@@ -3237,15 +2770,7 @@
     </w:p>
     <w:p>
       <w:r>
-        <w:t>Lemmatization was better. While Porter Stemming reduced vocabulary size slightly more, it generated non-word stems like '</w:t>
-      </w:r>
-      <w:proofErr w:type="spellStart"/>
-      <w:r>
-        <w:t>univers</w:t>
-      </w:r>
-      <w:proofErr w:type="spellEnd"/>
-      <w:r>
-        <w:t>'. Lemmatization kept valid English dictionary words (100% WordNet validity), which avoided breaking downstream features like spell correction and wildcard matching.</w:t>
+        <w:t>Lemmatization was better. While Porter Stemming reduced vocabulary size slightly more, it generated non-word stems like 'univers'. Lemmatization kept valid English dictionary words (100% WordNet validity), which avoided breaking downstream features like spell correction and wildcard matching.</w:t>
       </w:r>
     </w:p>
     <w:p>
@@ -3260,15 +2785,7 @@
     </w:p>
     <w:p>
       <w:r>
-        <w:t xml:space="preserve">The Positional Index was more accurate. The </w:t>
-      </w:r>
-      <w:proofErr w:type="spellStart"/>
-      <w:r>
-        <w:t>Biword</w:t>
-      </w:r>
-      <w:proofErr w:type="spellEnd"/>
-      <w:r>
-        <w:t xml:space="preserve"> Index generates false positives for queries of 3 or more words because it checks adjacent word pairs independently. The Positional Index checks exact word position numbers, guaranteeing correct word order.</w:t>
+        <w:t>The Positional Index was more accurate. The Biword Index generates false positives for queries of 3 or more words because it checks adjacent word pairs independently. The Positional Index checks exact word position numbers, guaranteeing correct word order.</w:t>
       </w:r>
     </w:p>
     <w:p>
@@ -3282,20 +2799,7 @@
     </w:p>
     <w:p>
       <w:r>
-        <w:t xml:space="preserve">In our in-memory Python tests on a small vocabulary (163 terms), the Binary Search Tree (BST) was consistently faster (~0.18-0.34 µs vs ~0.29-0.51 µs for B-Tree) due to simpler pointer operations. However, B-Trees maintain balanced height </w:t>
-      </w:r>
-      <w:proofErr w:type="gramStart"/>
-      <w:r>
-        <w:t>O(</w:t>
-      </w:r>
-      <w:proofErr w:type="spellStart"/>
-      <w:proofErr w:type="gramEnd"/>
-      <w:r>
-        <w:t>log_B</w:t>
-      </w:r>
-      <w:proofErr w:type="spellEnd"/>
-      <w:r>
-        <w:t xml:space="preserve"> N) and work much better for large disk-based indexes.</w:t>
+        <w:t>In our in-memory Python tests on a small vocabulary (163 terms), the Binary Search Tree (BST) was consistently faster (~0.18-0.34 µs vs ~0.29-0.51 µs for B-Tree) due to simpler pointer operations. However, B-Trees maintain balanced height O(log_B N) and work much better for large disk-based indexes.</w:t>
       </w:r>
     </w:p>
     <w:p>
@@ -3310,15 +2814,7 @@
     </w:p>
     <w:p>
       <w:r>
-        <w:t xml:space="preserve">Our model handled wildcards using a 2-gram index, spelling mistakes using </w:t>
-      </w:r>
-      <w:proofErr w:type="spellStart"/>
-      <w:r>
-        <w:t>Levenshtein</w:t>
-      </w:r>
-      <w:proofErr w:type="spellEnd"/>
-      <w:r>
-        <w:t xml:space="preserve"> edit distance (up to threshold distance 3), and sound-alike words using Soundex phonetic hashing.</w:t>
+        <w:t>Our model handled wildcards using a 2-gram index, spelling mistakes using Levenshtein edit distance (up to threshold distance 3), and sound-alike words using Soundex phonetic hashing.</w:t>
       </w:r>
     </w:p>
     <w:p>
@@ -3333,15 +2829,7 @@
     </w:p>
     <w:p>
       <w:r>
-        <w:t xml:space="preserve">Currently, our system returns unranked </w:t>
-      </w:r>
-      <w:proofErr w:type="spellStart"/>
-      <w:r>
-        <w:t>boolean</w:t>
-      </w:r>
-      <w:proofErr w:type="spellEnd"/>
-      <w:r>
-        <w:t xml:space="preserve"> matches without relevance scoring like TF-IDF or BM25. Also, the indexes are stored in memory rather than on disk.</w:t>
+        <w:t>Currently, our system returns unranked boolean matches without relevance scoring like TF-IDF or BM25. Also, the indexes are stored in memory rather than on disk.</w:t>
       </w:r>
     </w:p>
     <w:p>
@@ -3462,31 +2950,7 @@
     </w:p>
     <w:p>
       <w:r>
-        <w:t xml:space="preserve">The application was executed on a BITS-provisioned </w:t>
-      </w:r>
-      <w:proofErr w:type="spellStart"/>
-      <w:r>
-        <w:t>RunPod</w:t>
-      </w:r>
-      <w:proofErr w:type="spellEnd"/>
-      <w:r>
-        <w:t xml:space="preserve"> Virtual Lab pod (</w:t>
-      </w:r>
-      <w:proofErr w:type="spellStart"/>
-      <w:r>
-        <w:t>JupyterLab</w:t>
-      </w:r>
-      <w:proofErr w:type="spellEnd"/>
-      <w:r>
-        <w:t xml:space="preserve"> terminal), with </w:t>
-      </w:r>
-      <w:proofErr w:type="spellStart"/>
-      <w:r>
-        <w:t>Streamlit</w:t>
-      </w:r>
-      <w:proofErr w:type="spellEnd"/>
-      <w:r>
-        <w:t xml:space="preserve"> exposed publicly via a Cloudflare Tunnel so the front end could be verified in a standard browser rather than only on localhost.</w:t>
+        <w:t>The application was executed on a BITS-provisioned RunPod Virtual Lab pod (JupyterLab terminal), with Streamlit exposed publicly via a Cloudflare Tunnel so the front end could be verified in a standard browser rather than only on localhost.</w:t>
       </w:r>
     </w:p>
     <w:p>
@@ -3517,15 +2981,7 @@
         </w:numPr>
       </w:pPr>
       <w:r>
-        <w:t xml:space="preserve">Install required </w:t>
-      </w:r>
-      <w:proofErr w:type="gramStart"/>
-      <w:r>
-        <w:t>libraries :</w:t>
-      </w:r>
-      <w:proofErr w:type="gramEnd"/>
-      <w:r>
-        <w:t xml:space="preserve"> </w:t>
+        <w:t xml:space="preserve">Install required libraries : </w:t>
       </w:r>
       <w:r>
         <w:br/>
@@ -3534,30 +2990,8 @@
         <w:rPr>
           <w:highlight w:val="yellow"/>
         </w:rPr>
-        <w:t xml:space="preserve">pip install </w:t>
+        <w:t>pip install nltk pandas streamlit</w:t>
       </w:r>
-      <w:proofErr w:type="spellStart"/>
-      <w:r>
-        <w:rPr>
-          <w:highlight w:val="yellow"/>
-        </w:rPr>
-        <w:t>nltk</w:t>
-      </w:r>
-      <w:proofErr w:type="spellEnd"/>
-      <w:r>
-        <w:rPr>
-          <w:highlight w:val="yellow"/>
-        </w:rPr>
-        <w:t xml:space="preserve"> pandas </w:t>
-      </w:r>
-      <w:proofErr w:type="spellStart"/>
-      <w:r>
-        <w:rPr>
-          <w:highlight w:val="yellow"/>
-        </w:rPr>
-        <w:t>streamlit</w:t>
-      </w:r>
-      <w:proofErr w:type="spellEnd"/>
     </w:p>
     <w:p>
       <w:pPr>
@@ -3573,24 +3007,11 @@
         </w:numPr>
       </w:pPr>
       <w:r>
-        <w:t xml:space="preserve">download the standalone </w:t>
-      </w:r>
-      <w:proofErr w:type="spellStart"/>
-      <w:r>
-        <w:t>cloudflared</w:t>
-      </w:r>
-      <w:proofErr w:type="spellEnd"/>
-      <w:r>
-        <w:t xml:space="preserve"> binary, set execution permissions, and move it to your system </w:t>
-      </w:r>
-      <w:proofErr w:type="gramStart"/>
-      <w:r>
-        <w:t>PATH</w:t>
+        <w:t>download the standalone cloudflared binary, set execution permissions, and move it to your system PATH</w:t>
       </w:r>
       <w:r>
         <w:t xml:space="preserve"> :</w:t>
       </w:r>
-      <w:proofErr w:type="gramEnd"/>
       <w:r>
         <w:br/>
       </w:r>
@@ -3598,72 +3019,8 @@
         <w:rPr>
           <w:highlight w:val="yellow"/>
         </w:rPr>
-        <w:t>curl -L --output /</w:t>
+        <w:t>curl -L --output /usr/local/bin/cloudflared https://github.com/cloudflare/cloudflared/releases/latest/download/cloudflared-linux-amd64 &amp;&amp; chmod +x /usr/local/bin/cloudflared</w:t>
       </w:r>
-      <w:proofErr w:type="spellStart"/>
-      <w:r>
-        <w:rPr>
-          <w:highlight w:val="yellow"/>
-        </w:rPr>
-        <w:t>usr</w:t>
-      </w:r>
-      <w:proofErr w:type="spellEnd"/>
-      <w:r>
-        <w:rPr>
-          <w:highlight w:val="yellow"/>
-        </w:rPr>
-        <w:t>/local/bin/</w:t>
-      </w:r>
-      <w:proofErr w:type="spellStart"/>
-      <w:r>
-        <w:rPr>
-          <w:highlight w:val="yellow"/>
-        </w:rPr>
-        <w:t>cloudflared</w:t>
-      </w:r>
-      <w:proofErr w:type="spellEnd"/>
-      <w:r>
-        <w:rPr>
-          <w:highlight w:val="yellow"/>
-        </w:rPr>
-        <w:t xml:space="preserve"> https://github.com/cloudflare/cloudflared/releases/latest/download/cloudflared-linux-amd64 &amp;&amp; </w:t>
-      </w:r>
-      <w:proofErr w:type="spellStart"/>
-      <w:r>
-        <w:rPr>
-          <w:highlight w:val="yellow"/>
-        </w:rPr>
-        <w:t>chmod</w:t>
-      </w:r>
-      <w:proofErr w:type="spellEnd"/>
-      <w:r>
-        <w:rPr>
-          <w:highlight w:val="yellow"/>
-        </w:rPr>
-        <w:t xml:space="preserve"> +x /</w:t>
-      </w:r>
-      <w:proofErr w:type="spellStart"/>
-      <w:r>
-        <w:rPr>
-          <w:highlight w:val="yellow"/>
-        </w:rPr>
-        <w:t>usr</w:t>
-      </w:r>
-      <w:proofErr w:type="spellEnd"/>
-      <w:r>
-        <w:rPr>
-          <w:highlight w:val="yellow"/>
-        </w:rPr>
-        <w:t>/local/bin/</w:t>
-      </w:r>
-      <w:proofErr w:type="spellStart"/>
-      <w:r>
-        <w:rPr>
-          <w:highlight w:val="yellow"/>
-        </w:rPr>
-        <w:t>cloudflared</w:t>
-      </w:r>
-      <w:proofErr w:type="spellEnd"/>
     </w:p>
     <w:p>
       <w:pPr>
@@ -3679,70 +3036,49 @@
         </w:numPr>
       </w:pPr>
       <w:r>
-        <w:t xml:space="preserve">Launch </w:t>
-      </w:r>
-      <w:proofErr w:type="spellStart"/>
-      <w:r>
-        <w:t>Streamlit</w:t>
-      </w:r>
-      <w:proofErr w:type="spellEnd"/>
-      <w:r>
-        <w:t xml:space="preserve"> </w:t>
+        <w:t>Launch Streamlit app and receive localhost, network and external urls to connect the app</w:t>
       </w:r>
       <w:r>
-        <w:t>app:</w:t>
+        <w:t>:</w:t>
       </w:r>
       <w:r>
         <w:br/>
       </w:r>
-      <w:proofErr w:type="spellStart"/>
       <w:r>
         <w:rPr>
           <w:highlight w:val="yellow"/>
         </w:rPr>
-        <w:t>streamlit</w:t>
+        <w:t>streamlit run app.py --server.address 0.0.0.0 --server.port 8501</w:t>
       </w:r>
-      <w:proofErr w:type="spellEnd"/>
+    </w:p>
+    <w:p>
+      <w:pPr>
+        <w:rPr>
+          <w:lang w:val="en-IN"/>
+        </w:rPr>
+      </w:pPr>
+      <w:r>
+        <w:t xml:space="preserve">              </w:t>
+      </w:r>
       <w:r>
         <w:rPr>
-          <w:highlight w:val="yellow"/>
+          <w:lang w:val="en-IN"/>
         </w:rPr>
-        <w:t xml:space="preserve"> run app.py --</w:t>
+        <w:t>But, as BITS virtual environment doesn't have any browser to render UI, we need to go for step</w:t>
       </w:r>
-      <w:proofErr w:type="spellStart"/>
-      <w:proofErr w:type="gramStart"/>
       <w:r>
         <w:rPr>
-          <w:highlight w:val="yellow"/>
+          <w:lang w:val="en-IN"/>
         </w:rPr>
-        <w:t>server.address</w:t>
+        <w:t>-4</w:t>
       </w:r>
-      <w:proofErr w:type="spellEnd"/>
-      <w:proofErr w:type="gramEnd"/>
       <w:r>
         <w:rPr>
-          <w:highlight w:val="yellow"/>
+          <w:lang w:val="en-IN"/>
         </w:rPr>
-        <w:t xml:space="preserve"> 0.0.0.0 --</w:t>
-      </w:r>
-      <w:proofErr w:type="spellStart"/>
-      <w:proofErr w:type="gramStart"/>
-      <w:r>
-        <w:rPr>
-          <w:highlight w:val="yellow"/>
-        </w:rPr>
-        <w:t>server.port</w:t>
-      </w:r>
-      <w:proofErr w:type="spellEnd"/>
-      <w:proofErr w:type="gramEnd"/>
-      <w:r>
-        <w:rPr>
-          <w:highlight w:val="yellow"/>
-        </w:rPr>
-        <w:t xml:space="preserve"> 8501</w:t>
+        <w:t xml:space="preserve"> </w:t>
       </w:r>
     </w:p>
-    <w:p/>
     <w:p>
       <w:pPr>
         <w:pStyle w:val="ListParagraph"/>
@@ -3752,46 +3088,19 @@
         </w:numPr>
       </w:pPr>
       <w:r>
-        <w:t xml:space="preserve">Start Cloudflare Tunnel and output the public URL </w:t>
-      </w:r>
-      <w:proofErr w:type="gramStart"/>
-      <w:r>
-        <w:t>immediately</w:t>
+        <w:t>Start Cloudflare Tunnel and output the public URL immediately</w:t>
       </w:r>
       <w:r>
         <w:t xml:space="preserve"> :</w:t>
       </w:r>
-      <w:proofErr w:type="gramEnd"/>
       <w:r>
         <w:br/>
       </w:r>
-      <w:proofErr w:type="spellStart"/>
       <w:r>
         <w:rPr>
           <w:highlight w:val="yellow"/>
         </w:rPr>
-        <w:t>cloudflared</w:t>
-      </w:r>
-      <w:proofErr w:type="spellEnd"/>
-      <w:r>
-        <w:rPr>
-          <w:highlight w:val="yellow"/>
-        </w:rPr>
-        <w:t xml:space="preserve"> tunnel --</w:t>
-      </w:r>
-      <w:proofErr w:type="spellStart"/>
-      <w:r>
-        <w:rPr>
-          <w:highlight w:val="yellow"/>
-        </w:rPr>
-        <w:t>url</w:t>
-      </w:r>
-      <w:proofErr w:type="spellEnd"/>
-      <w:r>
-        <w:rPr>
-          <w:highlight w:val="yellow"/>
-        </w:rPr>
-        <w:t xml:space="preserve"> </w:t>
+        <w:t xml:space="preserve">cloudflared tunnel --url </w:t>
       </w:r>
       <w:hyperlink r:id="rId16" w:history="1">
         <w:r>
@@ -3898,53 +3207,12 @@
             <w:pPr>
               <w:jc w:val="center"/>
             </w:pPr>
-            <w:proofErr w:type="spellStart"/>
             <w:r>
               <w:rPr>
                 <w:i/>
                 <w:sz w:val="18"/>
               </w:rPr>
-              <w:t>JupyterLab</w:t>
-            </w:r>
-            <w:proofErr w:type="spellEnd"/>
-            <w:r>
-              <w:rPr>
-                <w:i/>
-                <w:sz w:val="18"/>
-              </w:rPr>
-              <w:t xml:space="preserve"> terminal on the </w:t>
-            </w:r>
-            <w:proofErr w:type="spellStart"/>
-            <w:r>
-              <w:rPr>
-                <w:i/>
-                <w:sz w:val="18"/>
-              </w:rPr>
-              <w:t>RunPod</w:t>
-            </w:r>
-            <w:proofErr w:type="spellEnd"/>
-            <w:r>
-              <w:rPr>
-                <w:i/>
-                <w:sz w:val="18"/>
-              </w:rPr>
-              <w:t xml:space="preserve"> pod showing </w:t>
-            </w:r>
-            <w:proofErr w:type="spellStart"/>
-            <w:r>
-              <w:rPr>
-                <w:i/>
-                <w:sz w:val="18"/>
-              </w:rPr>
-              <w:t>Streamlit</w:t>
-            </w:r>
-            <w:proofErr w:type="spellEnd"/>
-            <w:r>
-              <w:rPr>
-                <w:i/>
-                <w:sz w:val="18"/>
-              </w:rPr>
-              <w:t xml:space="preserve"> startup and the Cloudflare Tunnel generating a public URL (trycloudflare.com), later confirmed loading in a browser</w:t>
+              <w:t>JupyterLab terminal on the RunPod pod showing Streamlit startup and the Cloudflare Tunnel generating a public URL (trycloudflare.com), later confirmed loading in a browser</w:t>
             </w:r>
           </w:p>
         </w:tc>
@@ -4048,19 +3316,11 @@
             </w:tcMar>
           </w:tcPr>
           <w:p>
-            <w:proofErr w:type="spellStart"/>
             <w:r>
               <w:rPr>
                 <w:sz w:val="19"/>
               </w:rPr>
-              <w:t>Streamlit</w:t>
-            </w:r>
-            <w:proofErr w:type="spellEnd"/>
-            <w:r>
-              <w:rPr>
-                <w:sz w:val="19"/>
-              </w:rPr>
-              <w:t xml:space="preserve"> end-to-end workflow</w:t>
+              <w:t>Streamlit end-to-end workflow</w:t>
             </w:r>
           </w:p>
         </w:tc>
@@ -4195,21 +3455,7 @@
               <w:rPr>
                 <w:sz w:val="19"/>
               </w:rPr>
-              <w:t>Phrase query (</w:t>
-            </w:r>
-            <w:proofErr w:type="spellStart"/>
-            <w:r>
-              <w:rPr>
-                <w:sz w:val="19"/>
-              </w:rPr>
-              <w:t>Biword</w:t>
-            </w:r>
-            <w:proofErr w:type="spellEnd"/>
-            <w:r>
-              <w:rPr>
-                <w:sz w:val="19"/>
-              </w:rPr>
-              <w:t xml:space="preserve"> &amp; Positional)</w:t>
+              <w:t>Phrase query (Biword &amp; Positional)</w:t>
             </w:r>
           </w:p>
         </w:tc>
@@ -4225,33 +3471,11 @@
             </w:tcMar>
           </w:tcPr>
           <w:p>
-            <w:proofErr w:type="spellStart"/>
             <w:r>
               <w:rPr>
                 <w:sz w:val="19"/>
               </w:rPr>
-              <w:t>Biword</w:t>
-            </w:r>
-            <w:proofErr w:type="spellEnd"/>
-            <w:r>
-              <w:rPr>
-                <w:sz w:val="19"/>
-              </w:rPr>
-              <w:t xml:space="preserve"> and Positional indexes with </w:t>
-            </w:r>
-            <w:proofErr w:type="spellStart"/>
-            <w:r>
-              <w:rPr>
-                <w:sz w:val="19"/>
-              </w:rPr>
-              <w:t>biword</w:t>
-            </w:r>
-            <w:proofErr w:type="spellEnd"/>
-            <w:r>
-              <w:rPr>
-                <w:sz w:val="19"/>
-              </w:rPr>
-              <w:t xml:space="preserve"> false positive detection</w:t>
+              <w:t>Biword and Positional indexes with biword false positive detection</w:t>
             </w:r>
           </w:p>
         </w:tc>
@@ -4341,21 +3565,7 @@
               <w:rPr>
                 <w:sz w:val="19"/>
               </w:rPr>
-              <w:t xml:space="preserve">2-Gram wildcard index, </w:t>
-            </w:r>
-            <w:proofErr w:type="spellStart"/>
-            <w:r>
-              <w:rPr>
-                <w:sz w:val="19"/>
-              </w:rPr>
-              <w:t>Levenshtein</w:t>
-            </w:r>
-            <w:proofErr w:type="spellEnd"/>
-            <w:r>
-              <w:rPr>
-                <w:sz w:val="19"/>
-              </w:rPr>
-              <w:t xml:space="preserve"> edit distance, Soundex search</w:t>
+              <w:t>2-Gram wildcard index, Levenshtein edit distance, Soundex search</w:t>
             </w:r>
           </w:p>
         </w:tc>
@@ -4441,13 +3651,8 @@
             </w:tcMar>
           </w:tcPr>
           <w:p>
-            <w:proofErr w:type="spellStart"/>
             <w:r>
-              <w:t>Prayogshala</w:t>
-            </w:r>
-            <w:proofErr w:type="spellEnd"/>
-            <w:r>
-              <w:t xml:space="preserve"> Virtual Lab screenshots included, with terminal and Cloudflare Tunnel execution evidence</w:t>
+              <w:t>Prayogshala Virtual Lab screenshots included, with terminal and Cloudflare Tunnel execution evidence</w:t>
             </w:r>
           </w:p>
         </w:tc>
@@ -4638,6 +3843,119 @@
     </w:lvl>
   </w:abstractNum>
   <w:abstractNum w:abstractNumId="9" w15:restartNumberingAfterBreak="0">
+    <w:nsid w:val="5BA21F37"/>
+    <w:multiLevelType w:val="multilevel"/>
+    <w:tmpl w:val="7E30716A"/>
+    <w:lvl w:ilvl="0">
+      <w:start w:val="4"/>
+      <w:numFmt w:val="decimal"/>
+      <w:lvlText w:val="%1."/>
+      <w:lvlJc w:val="left"/>
+      <w:pPr>
+        <w:tabs>
+          <w:tab w:val="num" w:pos="720"/>
+        </w:tabs>
+        <w:ind w:left="720" w:hanging="360"/>
+      </w:pPr>
+    </w:lvl>
+    <w:lvl w:ilvl="1" w:tentative="1">
+      <w:start w:val="1"/>
+      <w:numFmt w:val="decimal"/>
+      <w:lvlText w:val="%2."/>
+      <w:lvlJc w:val="left"/>
+      <w:pPr>
+        <w:tabs>
+          <w:tab w:val="num" w:pos="1440"/>
+        </w:tabs>
+        <w:ind w:left="1440" w:hanging="360"/>
+      </w:pPr>
+    </w:lvl>
+    <w:lvl w:ilvl="2" w:tentative="1">
+      <w:start w:val="1"/>
+      <w:numFmt w:val="decimal"/>
+      <w:lvlText w:val="%3."/>
+      <w:lvlJc w:val="left"/>
+      <w:pPr>
+        <w:tabs>
+          <w:tab w:val="num" w:pos="2160"/>
+        </w:tabs>
+        <w:ind w:left="2160" w:hanging="360"/>
+      </w:pPr>
+    </w:lvl>
+    <w:lvl w:ilvl="3" w:tentative="1">
+      <w:start w:val="1"/>
+      <w:numFmt w:val="decimal"/>
+      <w:lvlText w:val="%4."/>
+      <w:lvlJc w:val="left"/>
+      <w:pPr>
+        <w:tabs>
+          <w:tab w:val="num" w:pos="2880"/>
+        </w:tabs>
+        <w:ind w:left="2880" w:hanging="360"/>
+      </w:pPr>
+    </w:lvl>
+    <w:lvl w:ilvl="4" w:tentative="1">
+      <w:start w:val="1"/>
+      <w:numFmt w:val="decimal"/>
+      <w:lvlText w:val="%5."/>
+      <w:lvlJc w:val="left"/>
+      <w:pPr>
+        <w:tabs>
+          <w:tab w:val="num" w:pos="3600"/>
+        </w:tabs>
+        <w:ind w:left="3600" w:hanging="360"/>
+      </w:pPr>
+    </w:lvl>
+    <w:lvl w:ilvl="5" w:tentative="1">
+      <w:start w:val="1"/>
+      <w:numFmt w:val="decimal"/>
+      <w:lvlText w:val="%6."/>
+      <w:lvlJc w:val="left"/>
+      <w:pPr>
+        <w:tabs>
+          <w:tab w:val="num" w:pos="4320"/>
+        </w:tabs>
+        <w:ind w:left="4320" w:hanging="360"/>
+      </w:pPr>
+    </w:lvl>
+    <w:lvl w:ilvl="6" w:tentative="1">
+      <w:start w:val="1"/>
+      <w:numFmt w:val="decimal"/>
+      <w:lvlText w:val="%7."/>
+      <w:lvlJc w:val="left"/>
+      <w:pPr>
+        <w:tabs>
+          <w:tab w:val="num" w:pos="5040"/>
+        </w:tabs>
+        <w:ind w:left="5040" w:hanging="360"/>
+      </w:pPr>
+    </w:lvl>
+    <w:lvl w:ilvl="7" w:tentative="1">
+      <w:start w:val="1"/>
+      <w:numFmt w:val="decimal"/>
+      <w:lvlText w:val="%8."/>
+      <w:lvlJc w:val="left"/>
+      <w:pPr>
+        <w:tabs>
+          <w:tab w:val="num" w:pos="5760"/>
+        </w:tabs>
+        <w:ind w:left="5760" w:hanging="360"/>
+      </w:pPr>
+    </w:lvl>
+    <w:lvl w:ilvl="8" w:tentative="1">
+      <w:start w:val="1"/>
+      <w:numFmt w:val="decimal"/>
+      <w:lvlText w:val="%9."/>
+      <w:lvlJc w:val="left"/>
+      <w:pPr>
+        <w:tabs>
+          <w:tab w:val="num" w:pos="6480"/>
+        </w:tabs>
+        <w:ind w:left="6480" w:hanging="360"/>
+      </w:pPr>
+    </w:lvl>
+  </w:abstractNum>
+  <w:abstractNum w:abstractNumId="10" w15:restartNumberingAfterBreak="0">
     <w:nsid w:val="723E04FC"/>
     <w:multiLevelType w:val="hybridMultilevel"/>
     <w:tmpl w:val="E0A6F4AA"/>
@@ -4726,7 +4044,7 @@
       </w:pPr>
     </w:lvl>
   </w:abstractNum>
-  <w:abstractNum w:abstractNumId="10" w15:restartNumberingAfterBreak="0">
+  <w:abstractNum w:abstractNumId="11" w15:restartNumberingAfterBreak="0">
     <w:nsid w:val="7A5A2B17"/>
     <w:multiLevelType w:val="hybridMultilevel"/>
     <w:tmpl w:val="CDBA009E"/>
@@ -4843,10 +4161,13 @@
     <w:abstractNumId w:val="0"/>
   </w:num>
   <w:num w:numId="10" w16cid:durableId="518353853">
-    <w:abstractNumId w:val="9"/>
+    <w:abstractNumId w:val="10"/>
   </w:num>
   <w:num w:numId="11" w16cid:durableId="1865554744">
-    <w:abstractNumId w:val="10"/>
+    <w:abstractNumId w:val="11"/>
+  </w:num>
+  <w:num w:numId="12" w16cid:durableId="1233807653">
+    <w:abstractNumId w:val="9"/>
   </w:num>
 </w:numbering>
 </file>
@@ -5461,7 +4782,6 @@
   <w:style w:type="character" w:default="1" w:styleId="DefaultParagraphFont">
     <w:name w:val="Default Paragraph Font"/>
     <w:uiPriority w:val="1"/>
-    <w:semiHidden/>
     <w:unhideWhenUsed/>
   </w:style>
   <w:style w:type="table" w:default="1" w:styleId="TableNormal">
@@ -16250,6 +15570,19 @@
     <w:rPr>
       <w:color w:val="605E5C"/>
       <w:shd w:val="clear" w:color="auto" w:fill="E1DFDD"/>
+    </w:rPr>
+  </w:style>
+  <w:style w:type="paragraph" w:styleId="NormalWeb">
+    <w:name w:val="Normal (Web)"/>
+    <w:basedOn w:val="Normal"/>
+    <w:uiPriority w:val="99"/>
+    <w:semiHidden/>
+    <w:unhideWhenUsed/>
+    <w:rsid w:val="00E228E5"/>
+    <w:rPr>
+      <w:rFonts w:ascii="Times New Roman" w:hAnsi="Times New Roman" w:cs="Times New Roman"/>
+      <w:sz w:val="24"/>
+      <w:szCs w:val="24"/>
     </w:rPr>
   </w:style>
 </w:styles>

</xml_diff>